<commit_message>
Bachelor files client-feedback pass: English-US conversion, figures for number words, page-self-references removed (brand voice); 8 bachelor DOCX regenerated; LP html/prototype/print-md updated
Co-authored-by: arena-agent <297053741+arena-agent@users.noreply.github.com>
</commit_message>
<xml_diff>
--- a/landing-page/program-detail/girne-american-university/bsc/01-bsc-in-psychology.docx
+++ b/landing-page/program-detail/girne-american-university/bsc/01-bsc-in-psychology.docx
@@ -38,7 +38,7 @@
         <w:t xml:space="preserve">Meta Description: </w:t>
       </w:r>
       <w:r>
-        <w:t>Study BSc Psychology online and develop knowledge in human behaviour, cognitive psychology, social psychology, developmental psychology, mental health and psychological research.</w:t>
+        <w:t>Study BSc Psychology online and develop knowledge in human behavior, cognitive psychology, social psychology, developmental psychology, mental health and psychological research.</w:t>
       </w:r>
     </w:p>
     <w:p>
@@ -65,7 +65,7 @@
         <w:rPr>
           <w:sz w:val="22"/>
         </w:rPr>
-        <w:t>Why do people behave the way they do? The Girne American University BSc in Psychology studies behaviour, cognition, personality, development, and social interaction scientifically, with research and critical thinking built in from the start.</w:t>
+        <w:t>Why do people behave the way they do? The Girne American University BSc in Psychology studies behavior, cognition, personality, development, and social interaction scientifically, with research and critical thinking built in from the start.</w:t>
       </w:r>
     </w:p>
     <w:p>
@@ -105,7 +105,7 @@
         <w:pStyle w:val="ListBullet"/>
       </w:pPr>
       <w:r>
-        <w:t>Psychology-focused programme</w:t>
+        <w:t>Psychology-focused program</w:t>
       </w:r>
     </w:p>
     <w:p>
@@ -137,7 +137,7 @@
         <w:pStyle w:val="Heading2"/>
       </w:pPr>
       <w:r>
-        <w:t>Programme at a Glance</w:t>
+        <w:t>Program At A Glance</w:t>
       </w:r>
     </w:p>
     <w:tbl>
@@ -220,7 +220,7 @@
                 <w:b/>
                 <w:sz w:val="20"/>
               </w:rPr>
-              <w:t>Specialisation</w:t>
+              <w:t>Specialization</w:t>
             </w:r>
           </w:p>
         </w:tc>
@@ -320,7 +320,7 @@
               <w:rPr>
                 <w:sz w:val="20"/>
               </w:rPr>
-              <w:t>Human Behaviour, Cognition, Development, Mental Health &amp; Psychological Research</w:t>
+              <w:t>Human Behavior, Cognition, Development, Mental Health &amp; Psychological Research</w:t>
             </w:r>
           </w:p>
         </w:tc>
@@ -334,7 +334,7 @@
         <w:t xml:space="preserve">Note: </w:t>
       </w:r>
       <w:r>
-        <w:t>Programme duration and entry route may vary depending on previous academic qualifications, approved credit transfer, and institutional requirements. Admissions confirms the exact pathway and fee structure in writing before any payment.</w:t>
+        <w:t>Program duration and entry route may vary depending on previous academic qualifications, approved credit transfer, and institutional requirements. Admissions confirms the exact pathway and fee structure in writing before any payment.</w:t>
       </w:r>
     </w:p>
     <w:p>
@@ -342,17 +342,17 @@
         <w:pStyle w:val="Heading2"/>
       </w:pPr>
       <w:r>
-        <w:t>Programme Overview</w:t>
+        <w:t>Program Overview</w:t>
       </w:r>
     </w:p>
     <w:p>
       <w:r>
-        <w:t>How does the brain influence thought and emotion? How are personality, childhood experiences, social environments, and relationships connected to human behaviour? The BSc Psychology programme explores these questions through the scientific study of behaviour and mental processes, developing knowledge across cognitive psychology, social psychology, developmental psychology, biological psychology, personality, mental health, and research methods.</w:t>
+        <w:t>How does the brain influence thought and emotion? How are personality, childhood experiences, social environments, and relationships connected to human behavior? The BSc Psychology program explores these questions through the scientific study of behavior and mental processes, developing knowledge across cognitive psychology, social psychology, developmental psychology, biological psychology, personality, mental health, and research methods.</w:t>
       </w:r>
     </w:p>
     <w:p>
       <w:r>
-        <w:t>Alongside theoretical knowledge, the programme builds practical skills in research, critical thinking, communication, data interpretation, and evidence-based analysis. It suits people interested in understanding human behaviour as a discipline in its own right, and professionals working across human resources, education, healthcare administration, training, customer experience, leadership, and community services who want the science behind what they already do.</w:t>
+        <w:t>Alongside theoretical knowledge, the program builds practical skills in research, critical thinking, communication, data interpretation, and evidence-based analysis. It suits people interested in understanding human behavior as a discipline in its own right, and professionals working across human resources, education, healthcare administration, training, customer experience, leadership, and community services who want the science behind what they already do.</w:t>
       </w:r>
     </w:p>
     <w:p>
@@ -360,7 +360,7 @@
         <w:pStyle w:val="Heading2"/>
       </w:pPr>
       <w:r>
-        <w:t>Why Choose This Programme</w:t>
+        <w:t>Why Choose This Program</w:t>
       </w:r>
     </w:p>
     <w:p>
@@ -368,7 +368,7 @@
         <w:rPr>
           <w:b/>
         </w:rPr>
-        <w:t>Understand human behaviour</w:t>
+        <w:t>Understand human behavior</w:t>
       </w:r>
     </w:p>
     <w:p>
@@ -386,7 +386,7 @@
     </w:p>
     <w:p>
       <w:r>
-        <w:t>How psychologists use research, evidence, and data to investigate human behaviour, rather than relying on intuition.</w:t>
+        <w:t>How psychologists use research, evidence, and data to investigate human behavior, rather than relying on intuition.</w:t>
       </w:r>
     </w:p>
     <w:p>
@@ -473,7 +473,7 @@
         <w:pStyle w:val="ListNumber"/>
       </w:pPr>
       <w:r>
-        <w:t>Analyse human behaviour from different psychological perspectives</w:t>
+        <w:t>Analyse human behavior from different psychological perspectives</w:t>
       </w:r>
     </w:p>
     <w:p>
@@ -497,7 +497,7 @@
         <w:pStyle w:val="ListNumber"/>
       </w:pPr>
       <w:r>
-        <w:t>Understand the influence of social environments on behaviour</w:t>
+        <w:t>Understand the influence of social environments on behavior</w:t>
       </w:r>
     </w:p>
     <w:p>
@@ -513,7 +513,7 @@
         <w:pStyle w:val="ListNumber"/>
       </w:pPr>
       <w:r>
-        <w:t>Understand the biological foundations of behaviour</w:t>
+        <w:t>Understand the biological foundations of behavior</w:t>
       </w:r>
     </w:p>
     <w:p>
@@ -673,7 +673,7 @@
         <w:pStyle w:val="ListBullet"/>
       </w:pPr>
       <w:r>
-        <w:t>Wellbeing Programme Coordinator</w:t>
+        <w:t>Wellbeing Program Coordinator</w:t>
       </w:r>
     </w:p>
     <w:p>
@@ -710,7 +710,7 @@
     </w:p>
     <w:p>
       <w:r>
-        <w:t>Roles come from the programme's official career areas. One caveat that stays on the page: some professional psychology occupations, including regulated roles such as psychologist, clinical psychologist, or counselling psychologist, normally require further postgraduate study, supervised professional training, and licensing depending on the country.</w:t>
+        <w:t>Roles come from the program's official career areas. One caveat we always state: some professional psychology occupations, including regulated roles such as psychologist, clinical psychologist, or counselling psychologist, normally require further postgraduate study, supervised professional training, and licensing depending on the country.</w:t>
       </w:r>
     </w:p>
     <w:p>
@@ -718,7 +718,7 @@
         <w:pStyle w:val="Heading2"/>
       </w:pPr>
       <w:r>
-        <w:t>Programme Structure</w:t>
+        <w:t>Program Structure</w:t>
       </w:r>
     </w:p>
     <w:p>
@@ -728,7 +728,7 @@
     </w:p>
     <w:p>
       <w:r>
-        <w:t>The programme progresses from fundamental principles into more advanced areas of human behaviour, mental processes, research, and applied psychology.</w:t>
+        <w:t>The program progresses from fundamental principles into more advanced areas of human behavior, mental processes, research, and applied psychology.</w:t>
       </w:r>
     </w:p>
     <w:p>
@@ -982,7 +982,7 @@
               <w:rPr>
                 <w:sz w:val="20"/>
               </w:rPr>
-              <w:t>Academic and professional perspectives relevant to psychology, research, and human behaviour</w:t>
+              <w:t>Academic and professional perspectives relevant to psychology, research, and human behavior</w:t>
             </w:r>
           </w:p>
         </w:tc>
@@ -1011,7 +1011,7 @@
               <w:rPr>
                 <w:sz w:val="20"/>
               </w:rPr>
-              <w:t>Ongoing support from enrolment through programme completion</w:t>
+              <w:t>Ongoing support from enrollment through program completion</w:t>
             </w:r>
           </w:p>
         </w:tc>
@@ -1174,7 +1174,7 @@
     </w:p>
     <w:p>
       <w:r>
-        <w:t>A deeper understanding of motivation, behaviour, communication, and interpersonal relationships, which is what management roles keep screening for.</w:t>
+        <w:t>A deeper understanding of motivation, behavior, communication, and interpersonal relationships, which is what management roles keep screening for.</w:t>
       </w:r>
     </w:p>
     <w:p>
@@ -1187,7 +1187,7 @@
     </w:p>
     <w:p>
       <w:r>
-        <w:t>After the bachelor's, graduates may explore MSc Psychology, organisational psychology, counselling-related programmes, human resource management, or MBA pathways, subject to university admission requirements. The GAU family here includes an MSc in Counselling Psychology.</w:t>
+        <w:t>After the bachelor's, graduates may explore MSc Psychology, organisational psychology, counselling-related programs, human resource management, or MBA pathways, subject to university admission requirements. The GAU family here includes an MSc in Counselling Psychology.</w:t>
       </w:r>
     </w:p>
     <w:p>
@@ -1200,7 +1200,7 @@
     </w:p>
     <w:p>
       <w:r>
-        <w:t>the bachelor's is a foundation, not a licence. Regulated psychologist roles need postgraduate study, supervised training, and licensing that vary by country, and planning for those steps early makes the whole path smoother.</w:t>
+        <w:t>the bachelor's is a foundation, not a license. Regulated psychologist roles need postgraduate study, supervised training, and licensing that vary by country, and planning for those steps early makes the whole path smoother.</w:t>
       </w:r>
     </w:p>
     <w:p>
@@ -1233,7 +1233,7 @@
                 <w:b/>
                 <w:sz w:val="20"/>
               </w:rPr>
-              <w:t>Programme Fees</w:t>
+              <w:t>Program Fees</w:t>
             </w:r>
           </w:p>
         </w:tc>
@@ -1304,7 +1304,7 @@
               <w:rPr>
                 <w:sz w:val="20"/>
               </w:rPr>
-              <w:t>Registration fee, initial payment, and monthly instalments itemised in the full structure</w:t>
+              <w:t>Registration fee, initial payment, and monthly installments itemised in the full structure</w:t>
             </w:r>
           </w:p>
         </w:tc>

</xml_diff>